<commit_message>
Add website, web page, and strategy document work to MGG Health role
Reflects current responsibilities for updating websites, creating new pages, and producing the strategies and supporting documents behind that work.

Co-authored-by: Darvin Patel <contact@darvinpatel.com>
</commit_message>
<xml_diff>
--- a/resume/Tanvi_Patel_Resume.docx
+++ b/resume/Tanvi_Patel_Resume.docx
@@ -63,7 +63,7 @@
           <w:i w:val="0"/>
           <w:sz w:val="21"/>
         </w:rPr>
-        <w:t>Results-driven Digital Marketing Coordinator and Design Specialist with 5+ years of experience in social media strategy, content creation, and brand marketing. Currently leading marketing for Global Medics and Medacs Healthcare at MGG Health, owning social media end to end across LinkedIn, Instagram, and Facebook, plus events and merchandise. Background in performance marketing across Meta and TikTok, with experience briefing and managing specialists who run paid media. Skilled in campaigns that lift engagement, generate leads, and strengthen brand identity. Proficient in Adobe Creative Suite, video production, and marketing analytics.</w:t>
+        <w:t>Results-driven Digital Marketing Coordinator and Design Specialist with 5+ years of experience in social media strategy, content creation, and brand marketing. Currently leading marketing for Global Medics and Medacs Healthcare at MGG Health, owning social media end to end across LinkedIn, Instagram, and Facebook, plus events, merchandise, website updates, and new web pages. Also creates the strategies and supporting documents behind that work. Background in performance marketing across Meta and TikTok, with experience briefing and managing specialists who run paid media. Proficient in Adobe Creative Suite, video production, and marketing analytics.</w:t>
       </w:r>
     </w:p>
     <w:p>
@@ -160,6 +160,32 @@
           <w:sz w:val="21"/>
         </w:rPr>
         <w:t>Plan and deliver brand events and merchandise programmes that support visibility and stakeholder engagement.</w:t>
+      </w:r>
+    </w:p>
+    <w:p>
+      <w:pPr>
+        <w:pStyle w:val="ListBullet"/>
+        <w:spacing w:before="0" w:after="20" w:line="269" w:lineRule="auto"/>
+        <w:ind w:left="360"/>
+      </w:pPr>
+      <w:r>
+        <w:rPr>
+          <w:rFonts w:ascii="Calibri" w:hAnsi="Calibri" w:eastAsia="Calibri"/>
+          <w:b/>
+          <w:i w:val="0"/>
+          <w:color w:val="14233A"/>
+          <w:sz w:val="21"/>
+        </w:rPr>
+        <w:t xml:space="preserve">Website &amp; Content Strategy: </w:t>
+      </w:r>
+      <w:r>
+        <w:rPr>
+          <w:rFonts w:ascii="Calibri" w:hAnsi="Calibri" w:eastAsia="Calibri"/>
+          <w:b w:val="0"/>
+          <w:i w:val="0"/>
+          <w:sz w:val="21"/>
+        </w:rPr>
+        <w:t>Update websites, create new web pages, and produce the strategies and supporting documents (briefs, content plans, and page copy) that guide those changes.</w:t>
       </w:r>
     </w:p>
     <w:p>
@@ -359,6 +385,22 @@
           <w:sz w:val="21"/>
         </w:rPr>
         <w:t>Lead marketing for two healthcare staffing brands within the MGG Health group, aligning activity with candidate attraction and client brand positioning.</w:t>
+      </w:r>
+    </w:p>
+    <w:p>
+      <w:pPr>
+        <w:pStyle w:val="ListBullet"/>
+        <w:spacing w:before="0" w:after="20" w:line="269" w:lineRule="auto"/>
+        <w:ind w:left="360"/>
+      </w:pPr>
+      <w:r>
+        <w:rPr>
+          <w:rFonts w:ascii="Calibri" w:hAnsi="Calibri" w:eastAsia="Calibri"/>
+          <w:b w:val="0"/>
+          <w:i w:val="0"/>
+          <w:sz w:val="21"/>
+        </w:rPr>
+        <w:t>Update brand websites and create new web pages, developing the strategy and relevant documents (briefs, content plans, and page copy) that support those changes.</w:t>
       </w:r>
     </w:p>
     <w:p>

</xml_diff>